<commit_message>
docs: publish Sol-reviewed development milestones and evidence replay
</commit_message>
<xml_diff>
--- a/docs/J_O_INAI6986_Milestone1_v4.docx
+++ b/docs/J_O_INAI6986_Milestone1_v4.docx
@@ -36,7 +36,7 @@
         <w:rPr>
           <w:i w:val="0"/>
         </w:rPr>
-        <w:t>J.O.  •  Dr. David M. Simmonds  •  Evidence through October 1, 2026, 4:01 PM CDT</w:t>
+        <w:t>J.O.  •  Dr. David M. Simmonds  •  Evidence snapshot: 2026-10-16 15:03:32 CDT</w:t>
       </w:r>
     </w:p>
     <w:tbl>
@@ -85,7 +85,7 @@
                 <w:color w:val="1F2937"/>
                 <w:sz w:val="18"/>
               </w:rPr>
-              <w:t>The original September 24 evidence and v3 remain historical. This revision adds the October 1 corrected Nemotron and Ornith runs to the completed Gemma/Muse series: sixteen nested-size training runs in four model families. All used the fixed 124 validation prompt IDs and zero protected test/control rows. Early September Muse runs with older methodology remain historical only, excluded from current metrics. Token-level fit is not factual-answer accuracy, and losses across different tokenizers cannot select a factual winner. No model has been promoted; the one-time final test remains untouched.</w:t>
+              <w:t>This post-feedback update incorporates the October 1 corrected training runs and verified October 8 development review. Sixteen nested-size training runs across four families used the fixed 124 validation prompt IDs and zero protected test/control rows. The proposed Nemotron checkpoint is only a provisional evaluation candidate: a 192-slot advisory probe tied three adapters at 4/24 fully supported answers and was neither human-scored nor a final test. Fresh-source exposure and final-seal gates remain unresolved; no deployment claim is made.</w:t>
             </w:r>
           </w:p>
         </w:tc>
@@ -1024,7 +1024,7 @@
         <w:rPr>
           <w:i w:val="0"/>
         </w:rPr>
-        <w:t>The current-practice baseline is the student manually finding a source and writing an answer. On thirty simple, hand-authored code/page lookups, all thirty gold answers were source-validated; retrospectively paired session timestamps estimate 42:06 total (about 1:24 each). These are easy, non-blind lookups, not a stopwatch trial and not proof of time savings on policy reasoning. Historical Muse pilot outputs are retained in a separate archive and are excluded from this current matched experiment. Neither baseline has yet been measured on the proposed harder control.</w:t>
+        <w:t>The practice reference is manual source lookup and answer drafting. Thirty original student-authored code/page lookups were source-validated; paired retrospective session timestamps estimate 42:06 total (about 1:24 each). This is an easy-task proxy, not a stopwatch trial or a representative policy-reasoning baseline. The proposed model-vs-untouched-base comparison is a separate technical control and has not been run on a locked final cohort.</w:t>
       </w:r>
     </w:p>
     <w:tbl>
@@ -1073,7 +1073,7 @@
                 <w:color w:val="1F2937"/>
                 <w:sz w:val="18"/>
               </w:rPr>
-              <w:t>All 30 items ask an answerable page or code lookup. Ten come from Jul26_34.pdf page 2, six from Jul26_28.pdf page 2 and five from Apr26_37.pdf page 2: 21/30 on three pages. This is an honest lookup diagnostic, not a representative policy-support or abstention benchmark. Eight to ten plausible unsupported cases and student-authored exception/date/conflict/multi-rule questions are required before an expanded control is frozen; none has been supplied or scored in this document.</w:t>
+              <w:t>All 30 items ask an answerable page or code lookup. Ten come from Jul26_34.pdf page 2, six from Jul26_28.pdf page 2 and five from Apr26_37.pdf page 2: 21/30 on three pages. This is an honest lookup diagnostic, not a representative policy-support or abstention benchmark. Nine supplementary pairs were submitted in Batch A (eight adopted local-AI drafts and one edited), not independently authored new controls. The user approved a separate local-AI/source-verified reasoning and unsupported-question benchmark; it has not yet been created. This changes authorship, not the instructor criterion, and no waiver is claimed.</w:t>
             </w:r>
           </w:p>
         </w:tc>
@@ -1106,7 +1106,7 @@
         <w:rPr>
           <w:i w:val="0"/>
         </w:rPr>
-        <w:t>The committed primary outcome is human-adjudicated factual accuracy on answerable policy questions. Correct source locator, unsupported-claim rate and abstention are safety-critical secondary outcomes. No human-scored, answer-level comparison on a representative independently authored control has occurred. The sixteen current runs (four sizes each for Muse, Gemma, Nemotron and Ornith) establish training and validation fit only. The table summarizes N=1,600; the full per-epoch cohorts appear separately in Appendices E and F.</w:t>
+        <w:t>The intended primary outcome is human-adjudicated factual accuracy on answerable policy questions; source locator, unsupported claims and abstention are safety-critical secondary outcomes. No same-split final comparison or final human-adjudicated model accuracy exists. A post-hoc local advisory v2 development probe scored 24 question-only slots per family and condition (not the fresh-source final benchmark): fully supported counts were Nemotron 4/24 base and 4/24 adapter, Gemma 0/24 and 4/24, Ornith 1/24 and 4/24, Muse 0/24 and 0/24; Muse adapter collection is incomplete. The 192-slot denominator included 150 accepted judgments, 19 budget failures and 23 parser failures; 17 total fully supported answers. The result is a tie among three adapters, not a factual winner. The sixteen current training runs establish token fit only; full per-epoch tables remain in Appendices E and F.</w:t>
       </w:r>
     </w:p>
     <w:p>
@@ -1890,7 +1890,7 @@
         <w:rPr>
           <w:i w:val="0"/>
         </w:rPr>
-        <w:t>No candidate is selected or promoted. Four families have completed four nested training sizes each on the locked validation IDs. The later eight corrected Nemotron/Ornith runs close a training-availability gap in v3, not the factual-selection gate. Teacher-forced loss and next-token accuracy compare checkpoints within a tokenizer; they cannot establish which model gives more accurate, sourced policy answers. No answer-level validation panel has been authorized, and the protected test/control must not be spent choosing a winner. Human duplicate disposition, representative student-authored reasoning/abstention control, predeclared candidate rationale and one-time final-test protocol are still open. The selected candidate and untouched base will be tested only once after those prerequisites.</w:t>
+        <w:t>Nemotron 3.5 Lightning N=1,600 checkpoint-400 is the user-approved proposed candidate for a governed evaluation, not a proven winner or deployment choice. The October 8 advisory v2 probe produced a tie at 4/24 fully supported answers for Nemotron, Gemma and Ornith adapters; Nemotron was proposed because its 48 generations completed and it aligned with submitted human error-review scope, while retaining 19/24 known unsupported adapter outputs. Advisory scoring is not human factuality. The final fresh benchmark, source-exposure clearance, immutable seal, native matched-base proof, final run and genuinely new required ratings remain open. The historical test cannot be reused as untouched.</w:t>
       </w:r>
     </w:p>
     <w:p>
@@ -1959,7 +1959,7 @@
                 <w:color w:val="1F2937"/>
                 <w:sz w:val="18"/>
               </w:rPr>
-              <w:t>The student must review all 16 answer groups against both questions and source pages, decide which are harmless shared values, boilerplate, or substantive repeated content, and remove/re-group any contaminated held-out item before a clean comparative score. The near-duplicate question pair also needs a source-level ruling. Existing LLM-scored workbook examples are not a human sign-off. A flagged H2011 “Daily” table-column error requires human verification and correction/quarantine before any affected row is reused.</w:t>
+              <w:t>Batch A human review was submitted October 5–6: all 16 cross-split answer groups (57 records) and the near-duplicate pair received human dispositions; the H2011 “Daily Max = 4” correction was recorded. This closes the review action, not every downstream remedy: a versioned re-split/re-hash and re-evaluation are still required before affected records can support comparative claims. The October 14 audit found no project-relative exposure evidence for 11 of 12 source documents and flagged one pharmacy source for review; unmatched bytes do not establish unseen policy semantics; final approval is false.</w:t>
             </w:r>
           </w:p>
         </w:tc>
@@ -1979,7 +1979,7 @@
         <w:rPr>
           <w:i w:val="0"/>
         </w:rPr>
-        <w:t>Every existing control item maps by full source URL and SHA-256 to a historical test document; Appendix B makes the per-item result visible. That refutes the specific concern that these thirty questions draw on training documents in the clean lineage, but does not fix their simple wording, source-page concentration, possible generated-test document overlap or absence of unanswerable cases. A revised student-authored control should be frozen separately and excluded from training, development tuning and candidate choice. Plan a sufficiently varied, source-verified answerable stratum and eight to ten plausible-but-unsupported items; score abstention and locator correctness with explicit denominators and a human adjudication key. Do not call the old 1/1 safety probe a 90% estimate.</w:t>
+        <w:t>Every existing control item maps by full source URL and SHA-256 to a historical test document; Appendix B makes the per-item result visible. That refutes the specific concern that these thirty questions draw on training documents in the clean lineage, but does not fix their simple wording, source-page concentration, possible generated-test document overlap or absence of unanswerable cases. Preserve the original controls; the authorized separate local-AI benchmark must cover reasoning, dates, exceptions, conflicts and a defensible unsupported stratum, excluded from training and tuning. Its different authorship does not satisfy an independent-student-authorship requirement by itself; score abstention and locator correctness with explicit denominators and a human adjudication key. Do not call the old 1/1 safety probe a 90% estimate.</w:t>
       </w:r>
     </w:p>
     <w:p>
@@ -2024,7 +2024,7 @@
         <w:rPr>
           <w:i w:val="0"/>
         </w:rPr>
-        <w:t>A candidate would be rejected or reconsidered if independently scored, source-verified policy questions do not improve answerable factual accuracy by at least 10 percentage points against untouched base, locator correctness is under 95%, unsupported claims reach 2% or more, abstention is under 90% on a meaningful unsupported set, safety routing is under 95%, general/format regression exceeds 3 points, interactive latency fails, or any leakage or rights defect persists. These are project targets, not results. A strong next-token score or a properly formatted URL cannot override human-scored factual and safety failures.</w:t>
+        <w:t>Before final exposure, development evidence could justify candidate reconsideration. After final exposure, threshold failure withholds promotion and requires a separately governed later development cycle—not tuning or testing a rival on that same final cohort. The fixed candidate is rejected for promotion if source-verified policy questions do not improve answerable factual accuracy by at least 10 percentage points against untouched base, locator correctness is under 95%, unsupported claims reach 2% or more, abstention is under 90% on a meaningful unsupported set, safety routing is under 95%, general/format regression exceeds 3 points, interactive latency fails, or any leakage or rights defect persists. These are project targets, not results. A strong next-token score or a properly formatted URL cannot override human-scored factual and safety failures.</w:t>
       </w:r>
     </w:p>
     <w:p>
@@ -2036,7 +2036,7 @@
         <w:rPr>
           <w:i w:val="0"/>
         </w:rPr>
-        <w:t>The October 9, 5:00 PM CDT fallback remains a decision gate: if an adapter-loaded or merged model has not produced a complete validated answer, stop adaptation on the critical path and pursue untouched base plus versioned retrieval, reporting adaptation as a negative result. If retrieval later supplies nearly all of the benefit, credit retrieval rather than fine-tuning.</w:t>
+        <w:t>The October 14 decision supersedes the older October 9 fallback: compare fixed Nemotron N=1,600 checkpoint-400 with its matched untouched base using identical official-source passages and questions. This replaces the earlier Muse comparator and question-only input mode. It isolates adaptation given the same evidence, not retrieval quality or actual analyst practice. No additional training or candidate search is authorized here.</w:t>
       </w:r>
     </w:p>
     <w:p>
@@ -2063,7 +2063,7 @@
     </w:p>
     <w:p>
       <w:r>
-        <w:t xml:space="preserve">Archived earlier-phase notebook (not the current model-results source): </w:t>
+        <w:t xml:space="preserve">Current evidence-replay notebook (not a final-test result): </w:t>
       </w:r>
       <w:hyperlink r:id="rId12">
         <w:r>
@@ -2071,7 +2071,7 @@
             <w:color w:val="32528B"/>
             <w:u w:val="single"/>
           </w:rPr>
-          <w:t>milestone1_reproducibility.ipynb</w:t>
+          <w:t>current_evidence_replay_20261016.ipynb</w:t>
         </w:r>
       </w:hyperlink>
     </w:p>
@@ -2084,7 +2084,7 @@
         <w:rPr>
           <w:i w:val="0"/>
         </w:rPr>
-        <w:t>That executed notebook documents the original dataset and legacy diagnostics; its historical model outputs are not part of the current comparison. Appendix E is generated from results.jsonl (28 Gemma/Muse epoch records). Appendix F is generated from architecture-training-gates/clean-runs/architecture-clean-run-matrix.json (24 corrected Nemotron/Ornith epoch records and eight integrity-verified archives). run_log.csv has sixteen experiment rows. These are training/validation token-fit records only: the earlier notebook is not a current raw-to-metric rerun of all sixteen models. A current reproducibility notebook and the one-time factual-test result remain open. The public repository hosts only the identity-protected J.O. deliverables; detailed training records reside in the private source of record.</w:t>
+        <w:t>The current evidence-replay notebook recomputes the historical corpus split and overlap, all sixteen training summaries (28 Gemma/Muse and 24 Nemotron/Ornith epoch rows), and the 192-slot development advisory matrix from per-output records. Appendices E–F contain the epoch tables. It executes offline from a fingerprint-verified portable bundle; it does not rerun training, generation or final evaluation. The earlier notebook is retained only as a historical audit. No final factual metric can be replayed because no final run exists. Detailed private records remain in the source-of-record repository; instructor access must be confirmed separately.</w:t>
       </w:r>
     </w:p>
     <w:p>
@@ -2282,7 +2282,7 @@
                 <w:color w:val="1F2937"/>
                 <w:sz w:val="15"/>
               </w:rPr>
-              <w:t>Open: student authors exception, effective-date, conflict and multi-rule items across more sources; original 30 remain lookup-only.</w:t>
+              <w:t>Open: create the approved local-AI/source-verified reasoning cohort. Original 30 remain unchanged; authorship limitation is disclosed.</w:t>
             </w:r>
           </w:p>
         </w:tc>
@@ -2341,7 +2341,7 @@
                 <w:color w:val="1F2937"/>
                 <w:sz w:val="15"/>
               </w:rPr>
-              <w:t>Open: add 8–10 independently authored unsupported questions and source-verify the bounded absence of an answer.</w:t>
+              <w:t>Open: verify a meaningful unsupported stratum against exact provided context; nine historical AI-assisted submissions are not the fresh cohort.</w:t>
             </w:r>
           </w:p>
         </w:tc>
@@ -2402,7 +2402,7 @@
                 <w:color w:val="1F2937"/>
                 <w:sz w:val="15"/>
               </w:rPr>
-              <w:t>Open: human-dispose all 16 groups / 57 records and one near-duplicate question pair; resolve flagged H2011 row.</w:t>
+              <w:t>Human Batch A dispositions submitted: 16 answer groups / 57 records + one near-duplicate pair; H2011 ruling: correct Daily Max to 4 in a new version; application to data/weights is not evidenced. Version remedies before reuse.</w:t>
             </w:r>
           </w:p>
         </w:tc>
@@ -2461,7 +2461,7 @@
                 <w:color w:val="1F2937"/>
                 <w:sz w:val="15"/>
               </w:rPr>
-              <w:t>Open after 16 completed runs: train/validation token metrics cannot rank cross-tokenizer factual generalization; do not peek at protected control.</w:t>
+              <w:t>Fixed for evaluation: Nemotron N1,600 checkpoint-400; selection is not a demonstrated factual win. Do not switch after final exposure.</w:t>
             </w:r>
           </w:p>
         </w:tc>
@@ -2542,7 +2542,7 @@
         <w:rPr>
           <w:i w:val="0"/>
         </w:rPr>
-        <w:t>This supplement addresses the feedback with verified repairs and an explicit unfinished-work boundary. It is not a claim that the expanded control, human leakage disposition, final comparison, or a particular course score has been achieved.</w:t>
+        <w:t>This supplement addresses feedback with verified human review, a disclosed provisional candidate proposal and an explicit unfinished-work boundary. It is not a claim that source exposure is approved, a clean expanded split exists, the final comparison has run or a particular course score has been achieved.</w:t>
       </w:r>
     </w:p>
     <w:p>
@@ -2567,7 +2567,15 @@
         <w:rPr>
           <w:i w:val="0"/>
         </w:rPr>
-        <w:t>AI assistance. Hermes Agent (GPT-6 Sol 900k for document preparation, with earlier GPT-6 Luna 900k work) reviewed course feedback, rubric, weekly instructions, training artifacts and layout; drafted and checked this update and its code. Local model workers—not the chat assistant—generated the original supervised data. AI prose does not count as human duplicate disposition, independently authored new control questions or measured factual outcomes.</w:t>
+        <w:t>Hermes Agent (GPT-6 Luna draft; GPT-6.1 Sol review) and local Qwen assisted writing, code and evidence checks; local workers generated development data and advice. I designed and directed the project, authored and source-checked the original controls, supplied human ratings and retain responsibility. AI did not supply human ratings or final-test results; I must approve this draft before submission.</w:t>
+      </w:r>
+    </w:p>
+    <w:p>
+      <w:pPr>
+        <w:pStyle w:val="Heading2"/>
+      </w:pPr>
+      <w:r>
+        <w:t>Expanded Assistance And Accountability Record</w:t>
       </w:r>
     </w:p>
     <w:p>
@@ -2579,7 +2587,19 @@
         <w:rPr>
           <w:i w:val="0"/>
         </w:rPr>
-        <w:t>Human authorship and accountability. J.O. conceived the project and selected the architecture, source scope, model candidates, metrics, split and guarded workflow; configured local hardware and services, directed agents, diagnosed training and checkpoint failures, and made proceed/stop/quarantine decisions. J.O. wrote and source-verified the original thirty control questions and answer keys. J.O. must author any new control questions, review flagged source evidence and approve final conclusions before submission. The student retains final responsibility for all content and project actions.</w:t>
+        <w:t>AI assistance. Hermes Agent (GPT-6 Luna 900k coordinating this document pass, with local Qwen3.8-Flash-Next-NVFP4 support for the Oct 16 evidence rebuild) reviewed course feedback, rubric, weekly instructions, training artifacts and layout; drafted and checked this update and its code. GPT-6.1 Sol 900k personally reviewed and corrected the evidence, narrative and final layouts in this pass. Local model workers—not the chat assistant—generated the original supervised data. AI prose does not count as human duplicate disposition, independently authored new control questions or measured factual outcomes.</w:t>
+      </w:r>
+    </w:p>
+    <w:p>
+      <w:pPr>
+        <w:keepLines w:val="0"/>
+        <w:widowControl/>
+      </w:pPr>
+      <w:r>
+        <w:rPr>
+          <w:i w:val="0"/>
+        </w:rPr>
+        <w:t>Human authorship and accountability. J.O. conceived the project and selected the architecture, source scope, model candidates, metrics, split and guarded workflow; configured local hardware and services, directed agents, diagnosed training and checkpoint failures, and made proceed/stop/quarantine decisions. J.O. wrote and source-verified the original thirty control questions and answer keys. Nine supplementary pairs were AI-assisted/student-adopted; separately approved fresh benchmark wording will be local-AI-authored and source-verified, not independently student-authored. No additional student writing is requested; genuinely new output ratings and approval of conclusions remain required. The student retains final responsibility for all content and project actions.</w:t>
       </w:r>
     </w:p>
     <w:p>
@@ -7266,7 +7286,7 @@
         <w:rPr>
           <w:i w:val="0"/>
         </w:rPr>
-        <w:t>These are reproducible flags, not human rulings. The canonical file yields sixteen punctuation/case-normalized answer groups spanning splits (57 member records). Review the questions, cited source pages and semantic meaning for every group in the human review workbook; a shared page number, repeated boilerplate and repeated policy answer require different remedies. Do not delete records merely because an answer string repeats. Keep the frozen original file and version a corrected split/file after human approval.</w:t>
+        <w:t>These are reproducible flags, not human rulings. The canonical file yields sixteen punctuation/case-normalized answer groups spanning splits (57 member records). Batch A has already supplied dispositions for all groups; a shared page number, repeated boilerplate and repeated policy answer require different remedies. Do not repeat that human work. Do not delete records merely because an answer string repeats. Keep the frozen original file and version a corrected split/file after human approval.</w:t>
       </w:r>
     </w:p>
     <w:tbl>
@@ -7507,7 +7527,7 @@
                 <w:color w:val="1F2937"/>
                 <w:sz w:val="14"/>
               </w:rPr>
-              <w:t>Needs source-level human ruling</w:t>
+              <w:t>Batch A ruling received; remedy not evidenced</w:t>
             </w:r>
           </w:p>
         </w:tc>
@@ -7624,7 +7644,7 @@
                 <w:color w:val="1F2937"/>
                 <w:sz w:val="14"/>
               </w:rPr>
-              <w:t>Needs source-level human ruling</w:t>
+              <w:t>Batch A ruling received; remedy not evidenced</w:t>
             </w:r>
           </w:p>
         </w:tc>
@@ -7737,7 +7757,7 @@
                 <w:color w:val="1F2937"/>
                 <w:sz w:val="14"/>
               </w:rPr>
-              <w:t>Needs source-level human ruling</w:t>
+              <w:t>Batch A ruling received; remedy not evidenced</w:t>
             </w:r>
           </w:p>
         </w:tc>
@@ -7854,7 +7874,7 @@
                 <w:color w:val="1F2937"/>
                 <w:sz w:val="14"/>
               </w:rPr>
-              <w:t>Needs source-level human ruling</w:t>
+              <w:t>Batch A ruling received; remedy not evidenced</w:t>
             </w:r>
           </w:p>
         </w:tc>
@@ -7967,7 +7987,7 @@
                 <w:color w:val="1F2937"/>
                 <w:sz w:val="14"/>
               </w:rPr>
-              <w:t>Needs source-level human ruling</w:t>
+              <w:t>Batch A ruling received; remedy not evidenced</w:t>
             </w:r>
           </w:p>
         </w:tc>
@@ -8084,7 +8104,7 @@
                 <w:color w:val="1F2937"/>
                 <w:sz w:val="14"/>
               </w:rPr>
-              <w:t>Needs source-level human ruling</w:t>
+              <w:t>Batch A ruling received; remedy not evidenced</w:t>
             </w:r>
           </w:p>
         </w:tc>
@@ -8197,7 +8217,7 @@
                 <w:color w:val="1F2937"/>
                 <w:sz w:val="14"/>
               </w:rPr>
-              <w:t>Needs source-level human ruling</w:t>
+              <w:t>Batch A ruling received; remedy not evidenced</w:t>
             </w:r>
           </w:p>
         </w:tc>
@@ -8314,7 +8334,7 @@
                 <w:color w:val="1F2937"/>
                 <w:sz w:val="14"/>
               </w:rPr>
-              <w:t>Needs source-level human ruling</w:t>
+              <w:t>Batch A ruling received; remedy not evidenced</w:t>
             </w:r>
           </w:p>
         </w:tc>
@@ -8427,7 +8447,7 @@
                 <w:color w:val="1F2937"/>
                 <w:sz w:val="14"/>
               </w:rPr>
-              <w:t>Needs source-level human ruling</w:t>
+              <w:t>Batch A ruling received; remedy not evidenced</w:t>
             </w:r>
           </w:p>
         </w:tc>
@@ -8544,7 +8564,7 @@
                 <w:color w:val="1F2937"/>
                 <w:sz w:val="14"/>
               </w:rPr>
-              <w:t>Needs source-level human ruling</w:t>
+              <w:t>Batch A ruling received; remedy not evidenced</w:t>
             </w:r>
           </w:p>
         </w:tc>
@@ -8657,7 +8677,7 @@
                 <w:color w:val="1F2937"/>
                 <w:sz w:val="14"/>
               </w:rPr>
-              <w:t>Needs source-level human ruling</w:t>
+              <w:t>Batch A ruling received; remedy not evidenced</w:t>
             </w:r>
           </w:p>
         </w:tc>
@@ -8774,7 +8794,7 @@
                 <w:color w:val="1F2937"/>
                 <w:sz w:val="14"/>
               </w:rPr>
-              <w:t>Needs source-level human ruling</w:t>
+              <w:t>Batch A ruling received; remedy not evidenced</w:t>
             </w:r>
           </w:p>
         </w:tc>
@@ -8887,7 +8907,7 @@
                 <w:color w:val="1F2937"/>
                 <w:sz w:val="14"/>
               </w:rPr>
-              <w:t>Needs source-level human ruling</w:t>
+              <w:t>Batch A ruling received; remedy not evidenced</w:t>
             </w:r>
           </w:p>
         </w:tc>
@@ -9004,7 +9024,7 @@
                 <w:color w:val="1F2937"/>
                 <w:sz w:val="14"/>
               </w:rPr>
-              <w:t>Needs source-level human ruling</w:t>
+              <w:t>Batch A ruling received; remedy not evidenced</w:t>
             </w:r>
           </w:p>
         </w:tc>
@@ -9117,7 +9137,7 @@
                 <w:color w:val="1F2937"/>
                 <w:sz w:val="14"/>
               </w:rPr>
-              <w:t>Needs source-level human ruling</w:t>
+              <w:t>Batch A ruling received; remedy not evidenced</w:t>
             </w:r>
           </w:p>
         </w:tc>
@@ -9234,7 +9254,7 @@
                 <w:color w:val="1F2937"/>
                 <w:sz w:val="14"/>
               </w:rPr>
-              <w:t>Needs source-level human ruling</w:t>
+              <w:t>Batch A ruling received; remedy not evidenced</w:t>
             </w:r>
           </w:p>
         </w:tc>
@@ -9254,7 +9274,7 @@
         <w:rPr>
           <w:i w:val="0"/>
         </w:rPr>
-        <w:t>The one cross-split near-duplicate question pair remains open. The separate quality-review human template and AI example are in artifacts/milestone1/quality_review/2026-09-24/; no sign-off is inferred from their existence. The original generated-set thirty-card human factual pilot is a different activity.</w:t>
+        <w:t>The cross-split near-duplicate pair also has a Batch A human disposition; any required versioned remedy and its effect on selected weights remain unevidenced. The separate quality-review human template and AI example are in artifacts/milestone1/quality_review/2026-09-24/; no sign-off is inferred from their existence. The original generated-set thirty-card human factual pilot is a different activity.</w:t>
       </w:r>
     </w:p>
     <w:p>
@@ -20649,6 +20669,1581 @@
         </w:rPr>
         <w:t>Within-family checkpoint selection is based on validation loss; no global candidate or deployment winner is asserted. The fixed validation identity is bound in architecture-clean-run-matrix.json; no test or independent-control rows entered these runs.</w:t>
       </w:r>
+    </w:p>
+    <w:p>
+      <w:r>
+        <w:br w:type="page"/>
+      </w:r>
+    </w:p>
+    <w:p>
+      <w:pPr>
+        <w:pStyle w:val="Heading1"/>
+      </w:pPr>
+      <w:r>
+        <w:t>Appendix G — Instructor Feedback Response</w:t>
+      </w:r>
+    </w:p>
+    <w:p>
+      <w:pPr>
+        <w:keepLines w:val="0"/>
+        <w:widowControl/>
+      </w:pPr>
+      <w:r>
+        <w:rPr>
+          <w:i w:val="0"/>
+        </w:rPr>
+        <w:t>Every substantive feedback item is mapped to its verified response and remaining limitation. Completed human work is preserved; new local-AI wording is not called student-authored. No grade or waiver is assumed.</w:t>
+      </w:r>
+    </w:p>
+    <w:tbl>
+      <w:tblPr>
+        <w:tblStyle w:val="TableGrid"/>
+        <w:tblW w:type="auto" w:w="0"/>
+        <w:tblLayout w:type="fixed"/>
+        <w:tblLook w:firstColumn="1" w:firstRow="1" w:lastColumn="0" w:lastRow="0" w:noHBand="0" w:noVBand="1" w:val="04A0"/>
+      </w:tblPr>
+      <w:tblGrid>
+        <w:gridCol w:w="3389"/>
+        <w:gridCol w:w="3389"/>
+        <w:gridCol w:w="3389"/>
+      </w:tblGrid>
+      <w:tr>
+        <w:trPr>
+          <w:tblHeader w:val="true"/>
+        </w:trPr>
+        <w:tc>
+          <w:tcPr>
+            <w:tcW w:type="dxa" w:w="792"/>
+            <w:vAlign w:val="center"/>
+            <w:tcMar>
+              <w:top w:w="55" w:type="dxa"/>
+              <w:start w:w="70" w:type="dxa"/>
+              <w:bottom w:w="55" w:type="dxa"/>
+              <w:end w:w="70" w:type="dxa"/>
+            </w:tcMar>
+            <w:shd w:fill="32528B"/>
+          </w:tcPr>
+          <w:p>
+            <w:pPr>
+              <w:spacing w:before="0" w:after="0" w:line="240" w:lineRule="auto"/>
+            </w:pPr>
+            <w:r/>
+            <w:r>
+              <w:rPr>
+                <w:rFonts w:ascii="Aptos" w:hAnsi="Aptos"/>
+                <w:b/>
+                <w:color w:val="FFFFFF"/>
+                <w:sz w:val="15"/>
+              </w:rPr>
+              <w:t>ID</w:t>
+            </w:r>
+          </w:p>
+        </w:tc>
+        <w:tc>
+          <w:tcPr>
+            <w:tcW w:type="dxa" w:w="2232"/>
+            <w:vAlign w:val="center"/>
+            <w:tcMar>
+              <w:top w:w="55" w:type="dxa"/>
+              <w:start w:w="70" w:type="dxa"/>
+              <w:bottom w:w="55" w:type="dxa"/>
+              <w:end w:w="70" w:type="dxa"/>
+            </w:tcMar>
+            <w:shd w:fill="32528B"/>
+          </w:tcPr>
+          <w:p>
+            <w:pPr>
+              <w:spacing w:before="0" w:after="0" w:line="240" w:lineRule="auto"/>
+            </w:pPr>
+            <w:r/>
+            <w:r>
+              <w:rPr>
+                <w:rFonts w:ascii="Aptos" w:hAnsi="Aptos"/>
+                <w:b/>
+                <w:color w:val="FFFFFF"/>
+                <w:sz w:val="15"/>
+              </w:rPr>
+              <w:t>Feedback Concern</w:t>
+            </w:r>
+          </w:p>
+        </w:tc>
+        <w:tc>
+          <w:tcPr>
+            <w:tcW w:type="dxa" w:w="7632"/>
+            <w:vAlign w:val="center"/>
+            <w:tcMar>
+              <w:top w:w="55" w:type="dxa"/>
+              <w:start w:w="70" w:type="dxa"/>
+              <w:bottom w:w="55" w:type="dxa"/>
+              <w:end w:w="70" w:type="dxa"/>
+            </w:tcMar>
+            <w:shd w:fill="32528B"/>
+          </w:tcPr>
+          <w:p>
+            <w:pPr>
+              <w:spacing w:before="0" w:after="0" w:line="240" w:lineRule="auto"/>
+            </w:pPr>
+            <w:r/>
+            <w:r>
+              <w:rPr>
+                <w:rFonts w:ascii="Aptos" w:hAnsi="Aptos"/>
+                <w:b/>
+                <w:color w:val="FFFFFF"/>
+                <w:sz w:val="15"/>
+              </w:rPr>
+              <w:t>Response, Evidence And Remaining Limitation</w:t>
+            </w:r>
+          </w:p>
+        </w:tc>
+      </w:tr>
+      <w:tr>
+        <w:trPr>
+          <w:cantSplit/>
+        </w:trPr>
+        <w:tc>
+          <w:tcPr>
+            <w:tcW w:type="dxa" w:w="792"/>
+            <w:vAlign w:val="center"/>
+            <w:tcMar>
+              <w:top w:w="55" w:type="dxa"/>
+              <w:start w:w="70" w:type="dxa"/>
+              <w:bottom w:w="55" w:type="dxa"/>
+              <w:end w:w="70" w:type="dxa"/>
+            </w:tcMar>
+          </w:tcPr>
+          <w:p>
+            <w:pPr>
+              <w:spacing w:before="0" w:after="0" w:line="240" w:lineRule="auto"/>
+            </w:pPr>
+            <w:r/>
+            <w:r>
+              <w:rPr>
+                <w:rFonts w:ascii="Aptos" w:hAnsi="Aptos"/>
+                <w:b w:val="0"/>
+                <w:color w:val="1F2937"/>
+                <w:sz w:val="15"/>
+              </w:rPr>
+              <w:t>M1-01</w:t>
+            </w:r>
+          </w:p>
+        </w:tc>
+        <w:tc>
+          <w:tcPr>
+            <w:tcW w:type="dxa" w:w="2232"/>
+            <w:vAlign w:val="center"/>
+            <w:tcMar>
+              <w:top w:w="55" w:type="dxa"/>
+              <w:start w:w="70" w:type="dxa"/>
+              <w:bottom w:w="55" w:type="dxa"/>
+              <w:end w:w="70" w:type="dxa"/>
+            </w:tcMar>
+          </w:tcPr>
+          <w:p>
+            <w:pPr>
+              <w:spacing w:before="0" w:after="0" w:line="240" w:lineRule="auto"/>
+            </w:pPr>
+            <w:r/>
+            <w:r>
+              <w:rPr>
+                <w:rFonts w:ascii="Aptos" w:hAnsi="Aptos"/>
+                <w:b w:val="0"/>
+                <w:color w:val="1F2937"/>
+                <w:sz w:val="15"/>
+              </w:rPr>
+              <w:t>Lookup-only questions</w:t>
+            </w:r>
+          </w:p>
+        </w:tc>
+        <w:tc>
+          <w:tcPr>
+            <w:tcW w:type="dxa" w:w="7632"/>
+            <w:vAlign w:val="center"/>
+            <w:tcMar>
+              <w:top w:w="55" w:type="dxa"/>
+              <w:start w:w="70" w:type="dxa"/>
+              <w:bottom w:w="55" w:type="dxa"/>
+              <w:end w:w="70" w:type="dxa"/>
+            </w:tcMar>
+          </w:tcPr>
+          <w:p>
+            <w:pPr>
+              <w:spacing w:before="0" w:after="0" w:line="240" w:lineRule="auto"/>
+            </w:pPr>
+            <w:r/>
+            <w:r>
+              <w:rPr>
+                <w:rFonts w:ascii="Aptos" w:hAnsi="Aptos"/>
+                <w:b w:val="0"/>
+                <w:color w:val="1F2937"/>
+                <w:sz w:val="15"/>
+              </w:rPr>
+              <w:t>Preserve all 30 originals; separately authorized reasoning/date/exception/conflict benchmark is not yet created. Local-AI authorship is disclosed; no instructor waiver.</w:t>
+            </w:r>
+          </w:p>
+        </w:tc>
+      </w:tr>
+      <w:tr>
+        <w:trPr>
+          <w:cantSplit/>
+        </w:trPr>
+        <w:tc>
+          <w:tcPr>
+            <w:tcW w:type="dxa" w:w="792"/>
+            <w:vAlign w:val="center"/>
+            <w:tcMar>
+              <w:top w:w="55" w:type="dxa"/>
+              <w:start w:w="70" w:type="dxa"/>
+              <w:bottom w:w="55" w:type="dxa"/>
+              <w:end w:w="70" w:type="dxa"/>
+            </w:tcMar>
+            <w:shd w:fill="F6F8FB"/>
+          </w:tcPr>
+          <w:p>
+            <w:pPr>
+              <w:spacing w:before="0" w:after="0" w:line="240" w:lineRule="auto"/>
+            </w:pPr>
+            <w:r/>
+            <w:r>
+              <w:rPr>
+                <w:rFonts w:ascii="Aptos" w:hAnsi="Aptos"/>
+                <w:b w:val="0"/>
+                <w:color w:val="1F2937"/>
+                <w:sz w:val="15"/>
+              </w:rPr>
+              <w:t>M1-02</w:t>
+            </w:r>
+          </w:p>
+        </w:tc>
+        <w:tc>
+          <w:tcPr>
+            <w:tcW w:type="dxa" w:w="2232"/>
+            <w:vAlign w:val="center"/>
+            <w:tcMar>
+              <w:top w:w="55" w:type="dxa"/>
+              <w:start w:w="70" w:type="dxa"/>
+              <w:bottom w:w="55" w:type="dxa"/>
+              <w:end w:w="70" w:type="dxa"/>
+            </w:tcMar>
+            <w:shd w:fill="F6F8FB"/>
+          </w:tcPr>
+          <w:p>
+            <w:pPr>
+              <w:spacing w:before="0" w:after="0" w:line="240" w:lineRule="auto"/>
+            </w:pPr>
+            <w:r/>
+            <w:r>
+              <w:rPr>
+                <w:rFonts w:ascii="Aptos" w:hAnsi="Aptos"/>
+                <w:b w:val="0"/>
+                <w:color w:val="1F2937"/>
+                <w:sz w:val="15"/>
+              </w:rPr>
+              <w:t>Unsupported questions</w:t>
+            </w:r>
+          </w:p>
+        </w:tc>
+        <w:tc>
+          <w:tcPr>
+            <w:tcW w:type="dxa" w:w="7632"/>
+            <w:vAlign w:val="center"/>
+            <w:tcMar>
+              <w:top w:w="55" w:type="dxa"/>
+              <w:start w:w="70" w:type="dxa"/>
+              <w:bottom w:w="55" w:type="dxa"/>
+              <w:end w:w="70" w:type="dxa"/>
+            </w:tcMar>
+            <w:shd w:fill="F6F8FB"/>
+          </w:tcPr>
+          <w:p>
+            <w:pPr>
+              <w:spacing w:before="0" w:after="0" w:line="240" w:lineRule="auto"/>
+            </w:pPr>
+            <w:r/>
+            <w:r>
+              <w:rPr>
+                <w:rFonts w:ascii="Aptos" w:hAnsi="Aptos"/>
+                <w:b w:val="0"/>
+                <w:color w:val="1F2937"/>
+                <w:sz w:val="15"/>
+              </w:rPr>
+              <w:t>Nine historical supplements received: eight adopted AI drafts, one edited. They are not independent student authorship or a verified fresh unsupported stratum.</w:t>
+            </w:r>
+          </w:p>
+        </w:tc>
+      </w:tr>
+      <w:tr>
+        <w:trPr>
+          <w:cantSplit/>
+        </w:trPr>
+        <w:tc>
+          <w:tcPr>
+            <w:tcW w:type="dxa" w:w="792"/>
+            <w:vAlign w:val="center"/>
+            <w:tcMar>
+              <w:top w:w="55" w:type="dxa"/>
+              <w:start w:w="70" w:type="dxa"/>
+              <w:bottom w:w="55" w:type="dxa"/>
+              <w:end w:w="70" w:type="dxa"/>
+            </w:tcMar>
+          </w:tcPr>
+          <w:p>
+            <w:pPr>
+              <w:spacing w:before="0" w:after="0" w:line="240" w:lineRule="auto"/>
+            </w:pPr>
+            <w:r/>
+            <w:r>
+              <w:rPr>
+                <w:rFonts w:ascii="Aptos" w:hAnsi="Aptos"/>
+                <w:b w:val="0"/>
+                <w:color w:val="1F2937"/>
+                <w:sz w:val="15"/>
+              </w:rPr>
+              <w:t>M1-03</w:t>
+            </w:r>
+          </w:p>
+        </w:tc>
+        <w:tc>
+          <w:tcPr>
+            <w:tcW w:type="dxa" w:w="2232"/>
+            <w:vAlign w:val="center"/>
+            <w:tcMar>
+              <w:top w:w="55" w:type="dxa"/>
+              <w:start w:w="70" w:type="dxa"/>
+              <w:bottom w:w="55" w:type="dxa"/>
+              <w:end w:w="70" w:type="dxa"/>
+            </w:tcMar>
+          </w:tcPr>
+          <w:p>
+            <w:pPr>
+              <w:spacing w:before="0" w:after="0" w:line="240" w:lineRule="auto"/>
+            </w:pPr>
+            <w:r/>
+            <w:r>
+              <w:rPr>
+                <w:rFonts w:ascii="Aptos" w:hAnsi="Aptos"/>
+                <w:b w:val="0"/>
+                <w:color w:val="1F2937"/>
+                <w:sz w:val="15"/>
+              </w:rPr>
+              <w:t>Narrow source coverage</w:t>
+            </w:r>
+          </w:p>
+        </w:tc>
+        <w:tc>
+          <w:tcPr>
+            <w:tcW w:type="dxa" w:w="7632"/>
+            <w:vAlign w:val="center"/>
+            <w:tcMar>
+              <w:top w:w="55" w:type="dxa"/>
+              <w:start w:w="70" w:type="dxa"/>
+              <w:bottom w:w="55" w:type="dxa"/>
+              <w:end w:w="70" w:type="dxa"/>
+            </w:tcMar>
+          </w:tcPr>
+          <w:p>
+            <w:pPr>
+              <w:spacing w:before="0" w:after="0" w:line="240" w:lineRule="auto"/>
+            </w:pPr>
+            <w:r/>
+            <w:r>
+              <w:rPr>
+                <w:rFonts w:ascii="Aptos" w:hAnsi="Aptos"/>
+                <w:b w:val="0"/>
+                <w:color w:val="1F2937"/>
+                <w:sz w:val="15"/>
+              </w:rPr>
+              <w:t>All 30 controls map by URL and hash to historical-test sources; 21/30 on three pages. Wording independence does not imply unseen sources.</w:t>
+            </w:r>
+          </w:p>
+        </w:tc>
+      </w:tr>
+      <w:tr>
+        <w:trPr>
+          <w:cantSplit/>
+        </w:trPr>
+        <w:tc>
+          <w:tcPr>
+            <w:tcW w:type="dxa" w:w="792"/>
+            <w:vAlign w:val="center"/>
+            <w:tcMar>
+              <w:top w:w="55" w:type="dxa"/>
+              <w:start w:w="70" w:type="dxa"/>
+              <w:bottom w:w="55" w:type="dxa"/>
+              <w:end w:w="70" w:type="dxa"/>
+            </w:tcMar>
+            <w:shd w:fill="F6F8FB"/>
+          </w:tcPr>
+          <w:p>
+            <w:pPr>
+              <w:spacing w:before="0" w:after="0" w:line="240" w:lineRule="auto"/>
+            </w:pPr>
+            <w:r/>
+            <w:r>
+              <w:rPr>
+                <w:rFonts w:ascii="Aptos" w:hAnsi="Aptos"/>
+                <w:b w:val="0"/>
+                <w:color w:val="1F2937"/>
+                <w:sz w:val="15"/>
+              </w:rPr>
+              <w:t>M1-04</w:t>
+            </w:r>
+          </w:p>
+        </w:tc>
+        <w:tc>
+          <w:tcPr>
+            <w:tcW w:type="dxa" w:w="2232"/>
+            <w:vAlign w:val="center"/>
+            <w:tcMar>
+              <w:top w:w="55" w:type="dxa"/>
+              <w:start w:w="70" w:type="dxa"/>
+              <w:bottom w:w="55" w:type="dxa"/>
+              <w:end w:w="70" w:type="dxa"/>
+            </w:tcMar>
+            <w:shd w:fill="F6F8FB"/>
+          </w:tcPr>
+          <w:p>
+            <w:pPr>
+              <w:spacing w:before="0" w:after="0" w:line="240" w:lineRule="auto"/>
+            </w:pPr>
+            <w:r/>
+            <w:r>
+              <w:rPr>
+                <w:rFonts w:ascii="Aptos" w:hAnsi="Aptos"/>
+                <w:b w:val="0"/>
+                <w:color w:val="1F2937"/>
+                <w:sz w:val="15"/>
+              </w:rPr>
+              <w:t>Ceiling baseline / URL formatting</w:t>
+            </w:r>
+          </w:p>
+        </w:tc>
+        <w:tc>
+          <w:tcPr>
+            <w:tcW w:type="dxa" w:w="7632"/>
+            <w:vAlign w:val="center"/>
+            <w:tcMar>
+              <w:top w:w="55" w:type="dxa"/>
+              <w:start w:w="70" w:type="dxa"/>
+              <w:bottom w:w="55" w:type="dxa"/>
+              <w:end w:w="70" w:type="dxa"/>
+            </w:tcMar>
+            <w:shd w:fill="F6F8FB"/>
+          </w:tcPr>
+          <w:p>
+            <w:pPr>
+              <w:spacing w:before="0" w:after="0" w:line="240" w:lineRule="auto"/>
+            </w:pPr>
+            <w:r/>
+            <w:r>
+              <w:rPr>
+                <w:rFonts w:ascii="Aptos" w:hAnsi="Aptos"/>
+                <w:b w:val="0"/>
+                <w:color w:val="1F2937"/>
+                <w:sz w:val="15"/>
+              </w:rPr>
+              <w:t>Manual 30/30 is an easy lookup reference; 84 seconds is a retrospective proxy. Current 192-slot advisory results are not final/human accuracy or time savings.</w:t>
+            </w:r>
+          </w:p>
+        </w:tc>
+      </w:tr>
+      <w:tr>
+        <w:trPr>
+          <w:cantSplit/>
+        </w:trPr>
+        <w:tc>
+          <w:tcPr>
+            <w:tcW w:type="dxa" w:w="792"/>
+            <w:vAlign w:val="center"/>
+            <w:tcMar>
+              <w:top w:w="55" w:type="dxa"/>
+              <w:start w:w="70" w:type="dxa"/>
+              <w:bottom w:w="55" w:type="dxa"/>
+              <w:end w:w="70" w:type="dxa"/>
+            </w:tcMar>
+          </w:tcPr>
+          <w:p>
+            <w:pPr>
+              <w:spacing w:before="0" w:after="0" w:line="240" w:lineRule="auto"/>
+            </w:pPr>
+            <w:r/>
+            <w:r>
+              <w:rPr>
+                <w:rFonts w:ascii="Aptos" w:hAnsi="Aptos"/>
+                <w:b w:val="0"/>
+                <w:color w:val="1F2937"/>
+                <w:sz w:val="15"/>
+              </w:rPr>
+              <w:t>M1-05</w:t>
+            </w:r>
+          </w:p>
+        </w:tc>
+        <w:tc>
+          <w:tcPr>
+            <w:tcW w:type="dxa" w:w="2232"/>
+            <w:vAlign w:val="center"/>
+            <w:tcMar>
+              <w:top w:w="55" w:type="dxa"/>
+              <w:start w:w="70" w:type="dxa"/>
+              <w:bottom w:w="55" w:type="dxa"/>
+              <w:end w:w="70" w:type="dxa"/>
+            </w:tcMar>
+          </w:tcPr>
+          <w:p>
+            <w:pPr>
+              <w:spacing w:before="0" w:after="0" w:line="240" w:lineRule="auto"/>
+            </w:pPr>
+            <w:r/>
+            <w:r>
+              <w:rPr>
+                <w:rFonts w:ascii="Aptos" w:hAnsi="Aptos"/>
+                <w:b w:val="0"/>
+                <w:color w:val="1F2937"/>
+                <w:sz w:val="15"/>
+              </w:rPr>
+              <w:t>Duplicate-answer leakage</w:t>
+            </w:r>
+          </w:p>
+        </w:tc>
+        <w:tc>
+          <w:tcPr>
+            <w:tcW w:type="dxa" w:w="7632"/>
+            <w:vAlign w:val="center"/>
+            <w:tcMar>
+              <w:top w:w="55" w:type="dxa"/>
+              <w:start w:w="70" w:type="dxa"/>
+              <w:bottom w:w="55" w:type="dxa"/>
+              <w:end w:w="70" w:type="dxa"/>
+            </w:tcMar>
+          </w:tcPr>
+          <w:p>
+            <w:pPr>
+              <w:spacing w:before="0" w:after="0" w:line="240" w:lineRule="auto"/>
+            </w:pPr>
+            <w:r/>
+            <w:r>
+              <w:rPr>
+                <w:rFonts w:ascii="Aptos" w:hAnsi="Aptos"/>
+                <w:b w:val="0"/>
+                <w:color w:val="1F2937"/>
+                <w:sz w:val="15"/>
+              </w:rPr>
+              <w:t>All 16 groups / 57 records have Batch A human dispositions. Application of versioned remedies to canonical data and selected weights is not evidenced.</w:t>
+            </w:r>
+          </w:p>
+        </w:tc>
+      </w:tr>
+      <w:tr>
+        <w:trPr>
+          <w:cantSplit/>
+        </w:trPr>
+        <w:tc>
+          <w:tcPr>
+            <w:tcW w:type="dxa" w:w="792"/>
+            <w:vAlign w:val="center"/>
+            <w:tcMar>
+              <w:top w:w="55" w:type="dxa"/>
+              <w:start w:w="70" w:type="dxa"/>
+              <w:bottom w:w="55" w:type="dxa"/>
+              <w:end w:w="70" w:type="dxa"/>
+            </w:tcMar>
+            <w:shd w:fill="F6F8FB"/>
+          </w:tcPr>
+          <w:p>
+            <w:pPr>
+              <w:spacing w:before="0" w:after="0" w:line="240" w:lineRule="auto"/>
+            </w:pPr>
+            <w:r/>
+            <w:r>
+              <w:rPr>
+                <w:rFonts w:ascii="Aptos" w:hAnsi="Aptos"/>
+                <w:b w:val="0"/>
+                <w:color w:val="1F2937"/>
+                <w:sz w:val="15"/>
+              </w:rPr>
+              <w:t>M1-06</w:t>
+            </w:r>
+          </w:p>
+        </w:tc>
+        <w:tc>
+          <w:tcPr>
+            <w:tcW w:type="dxa" w:w="2232"/>
+            <w:vAlign w:val="center"/>
+            <w:tcMar>
+              <w:top w:w="55" w:type="dxa"/>
+              <w:start w:w="70" w:type="dxa"/>
+              <w:bottom w:w="55" w:type="dxa"/>
+              <w:end w:w="70" w:type="dxa"/>
+            </w:tcMar>
+            <w:shd w:fill="F6F8FB"/>
+          </w:tcPr>
+          <w:p>
+            <w:pPr>
+              <w:spacing w:before="0" w:after="0" w:line="240" w:lineRule="auto"/>
+            </w:pPr>
+            <w:r/>
+            <w:r>
+              <w:rPr>
+                <w:rFonts w:ascii="Aptos" w:hAnsi="Aptos"/>
+                <w:b w:val="0"/>
+                <w:color w:val="1F2937"/>
+                <w:sz w:val="15"/>
+              </w:rPr>
+              <w:t>Insufficient alternatives</w:t>
+            </w:r>
+          </w:p>
+        </w:tc>
+        <w:tc>
+          <w:tcPr>
+            <w:tcW w:type="dxa" w:w="7632"/>
+            <w:vAlign w:val="center"/>
+            <w:tcMar>
+              <w:top w:w="55" w:type="dxa"/>
+              <w:start w:w="70" w:type="dxa"/>
+              <w:bottom w:w="55" w:type="dxa"/>
+              <w:end w:w="70" w:type="dxa"/>
+            </w:tcMar>
+            <w:shd w:fill="F6F8FB"/>
+          </w:tcPr>
+          <w:p>
+            <w:pPr>
+              <w:spacing w:before="0" w:after="0" w:line="240" w:lineRule="auto"/>
+            </w:pPr>
+            <w:r/>
+            <w:r>
+              <w:rPr>
+                <w:rFonts w:ascii="Aptos" w:hAnsi="Aptos"/>
+                <w:b w:val="0"/>
+                <w:color w:val="1F2937"/>
+                <w:sz w:val="15"/>
+              </w:rPr>
+              <w:t>Four genuine families at four nested sizes; 16 completed runs. Three adapters tie at 4/24 advisory support. Fixed Nemotron400 is a governed candidate, not a winner.</w:t>
+            </w:r>
+          </w:p>
+        </w:tc>
+      </w:tr>
+      <w:tr>
+        <w:trPr>
+          <w:cantSplit/>
+        </w:trPr>
+        <w:tc>
+          <w:tcPr>
+            <w:tcW w:type="dxa" w:w="792"/>
+            <w:vAlign w:val="center"/>
+            <w:tcMar>
+              <w:top w:w="55" w:type="dxa"/>
+              <w:start w:w="70" w:type="dxa"/>
+              <w:bottom w:w="55" w:type="dxa"/>
+              <w:end w:w="70" w:type="dxa"/>
+            </w:tcMar>
+          </w:tcPr>
+          <w:p>
+            <w:pPr>
+              <w:spacing w:before="0" w:after="0" w:line="240" w:lineRule="auto"/>
+            </w:pPr>
+            <w:r/>
+            <w:r>
+              <w:rPr>
+                <w:rFonts w:ascii="Aptos" w:hAnsi="Aptos"/>
+                <w:b w:val="0"/>
+                <w:color w:val="1F2937"/>
+                <w:sz w:val="15"/>
+              </w:rPr>
+              <w:t>M1-07</w:t>
+            </w:r>
+          </w:p>
+        </w:tc>
+        <w:tc>
+          <w:tcPr>
+            <w:tcW w:type="dxa" w:w="2232"/>
+            <w:vAlign w:val="center"/>
+            <w:tcMar>
+              <w:top w:w="55" w:type="dxa"/>
+              <w:start w:w="70" w:type="dxa"/>
+              <w:bottom w:w="55" w:type="dxa"/>
+              <w:end w:w="70" w:type="dxa"/>
+            </w:tcMar>
+          </w:tcPr>
+          <w:p>
+            <w:pPr>
+              <w:spacing w:before="0" w:after="0" w:line="240" w:lineRule="auto"/>
+            </w:pPr>
+            <w:r/>
+            <w:r>
+              <w:rPr>
+                <w:rFonts w:ascii="Aptos" w:hAnsi="Aptos"/>
+                <w:b w:val="0"/>
+                <w:color w:val="1F2937"/>
+                <w:sz w:val="15"/>
+              </w:rPr>
+              <w:t>Overlong control appendix</w:t>
+            </w:r>
+          </w:p>
+        </w:tc>
+        <w:tc>
+          <w:tcPr>
+            <w:tcW w:type="dxa" w:w="7632"/>
+            <w:vAlign w:val="center"/>
+            <w:tcMar>
+              <w:top w:w="55" w:type="dxa"/>
+              <w:start w:w="70" w:type="dxa"/>
+              <w:bottom w:w="55" w:type="dxa"/>
+              <w:end w:w="70" w:type="dxa"/>
+            </w:tcMar>
+          </w:tcPr>
+          <w:p>
+            <w:pPr>
+              <w:spacing w:before="0" w:after="0" w:line="240" w:lineRule="auto"/>
+            </w:pPr>
+            <w:r/>
+            <w:r>
+              <w:rPr>
+                <w:rFonts w:ascii="Aptos" w:hAnsi="Aptos"/>
+                <w:b w:val="0"/>
+                <w:color w:val="1F2937"/>
+                <w:sz w:val="15"/>
+              </w:rPr>
+              <w:t>Two compact source-split tables preserve original wording and show coverage; original detailed evidence remains archived.</w:t>
+            </w:r>
+          </w:p>
+        </w:tc>
+      </w:tr>
+      <w:tr>
+        <w:trPr>
+          <w:cantSplit/>
+        </w:trPr>
+        <w:tc>
+          <w:tcPr>
+            <w:tcW w:type="dxa" w:w="792"/>
+            <w:vAlign w:val="center"/>
+            <w:tcMar>
+              <w:top w:w="55" w:type="dxa"/>
+              <w:start w:w="70" w:type="dxa"/>
+              <w:bottom w:w="55" w:type="dxa"/>
+              <w:end w:w="70" w:type="dxa"/>
+            </w:tcMar>
+            <w:shd w:fill="F6F8FB"/>
+          </w:tcPr>
+          <w:p>
+            <w:pPr>
+              <w:spacing w:before="0" w:after="0" w:line="240" w:lineRule="auto"/>
+            </w:pPr>
+            <w:r/>
+            <w:r>
+              <w:rPr>
+                <w:rFonts w:ascii="Aptos" w:hAnsi="Aptos"/>
+                <w:b w:val="0"/>
+                <w:color w:val="1F2937"/>
+                <w:sz w:val="15"/>
+              </w:rPr>
+              <w:t>M1-08</w:t>
+            </w:r>
+          </w:p>
+        </w:tc>
+        <w:tc>
+          <w:tcPr>
+            <w:tcW w:type="dxa" w:w="2232"/>
+            <w:vAlign w:val="center"/>
+            <w:tcMar>
+              <w:top w:w="55" w:type="dxa"/>
+              <w:start w:w="70" w:type="dxa"/>
+              <w:bottom w:w="55" w:type="dxa"/>
+              <w:end w:w="70" w:type="dxa"/>
+            </w:tcMar>
+            <w:shd w:fill="F6F8FB"/>
+          </w:tcPr>
+          <w:p>
+            <w:pPr>
+              <w:spacing w:before="0" w:after="0" w:line="240" w:lineRule="auto"/>
+            </w:pPr>
+            <w:r/>
+            <w:r>
+              <w:rPr>
+                <w:rFonts w:ascii="Aptos" w:hAnsi="Aptos"/>
+                <w:b w:val="0"/>
+                <w:color w:val="1F2937"/>
+                <w:sz w:val="15"/>
+              </w:rPr>
+              <w:t>Source-column and exposure defects</w:t>
+            </w:r>
+          </w:p>
+        </w:tc>
+        <w:tc>
+          <w:tcPr>
+            <w:tcW w:type="dxa" w:w="7632"/>
+            <w:vAlign w:val="center"/>
+            <w:tcMar>
+              <w:top w:w="55" w:type="dxa"/>
+              <w:start w:w="70" w:type="dxa"/>
+              <w:bottom w:w="55" w:type="dxa"/>
+              <w:end w:w="70" w:type="dxa"/>
+            </w:tcMar>
+            <w:shd w:fill="F6F8FB"/>
+          </w:tcPr>
+          <w:p>
+            <w:pPr>
+              <w:spacing w:before="0" w:after="0" w:line="240" w:lineRule="auto"/>
+            </w:pPr>
+            <w:r/>
+            <w:r>
+              <w:rPr>
+                <w:rFonts w:ascii="Aptos" w:hAnsi="Aptos"/>
+                <w:b w:val="0"/>
+                <w:color w:val="1F2937"/>
+                <w:sz w:val="15"/>
+              </w:rPr>
+              <w:t>Near-duplicate ruling and H2011 Daily Max=4 correction direction received. Do not claim existing weights were repaired. Historical test remains exposed.</w:t>
+            </w:r>
+          </w:p>
+        </w:tc>
+      </w:tr>
+      <w:tr>
+        <w:trPr>
+          <w:cantSplit/>
+        </w:trPr>
+        <w:tc>
+          <w:tcPr>
+            <w:tcW w:type="dxa" w:w="792"/>
+            <w:vAlign w:val="center"/>
+            <w:tcMar>
+              <w:top w:w="55" w:type="dxa"/>
+              <w:start w:w="70" w:type="dxa"/>
+              <w:bottom w:w="55" w:type="dxa"/>
+              <w:end w:w="70" w:type="dxa"/>
+            </w:tcMar>
+          </w:tcPr>
+          <w:p>
+            <w:pPr>
+              <w:spacing w:before="0" w:after="0" w:line="240" w:lineRule="auto"/>
+            </w:pPr>
+            <w:r/>
+            <w:r>
+              <w:rPr>
+                <w:rFonts w:ascii="Aptos" w:hAnsi="Aptos"/>
+                <w:b w:val="0"/>
+                <w:color w:val="1F2937"/>
+                <w:sz w:val="15"/>
+              </w:rPr>
+              <w:t>M1-09</w:t>
+            </w:r>
+          </w:p>
+        </w:tc>
+        <w:tc>
+          <w:tcPr>
+            <w:tcW w:type="dxa" w:w="2232"/>
+            <w:vAlign w:val="center"/>
+            <w:tcMar>
+              <w:top w:w="55" w:type="dxa"/>
+              <w:start w:w="70" w:type="dxa"/>
+              <w:bottom w:w="55" w:type="dxa"/>
+              <w:end w:w="70" w:type="dxa"/>
+            </w:tcMar>
+          </w:tcPr>
+          <w:p>
+            <w:pPr>
+              <w:spacing w:before="0" w:after="0" w:line="240" w:lineRule="auto"/>
+            </w:pPr>
+            <w:r/>
+            <w:r>
+              <w:rPr>
+                <w:rFonts w:ascii="Aptos" w:hAnsi="Aptos"/>
+                <w:b w:val="0"/>
+                <w:color w:val="1F2937"/>
+                <w:sz w:val="15"/>
+              </w:rPr>
+              <w:t>Priority before next milestone</w:t>
+            </w:r>
+          </w:p>
+        </w:tc>
+        <w:tc>
+          <w:tcPr>
+            <w:tcW w:type="dxa" w:w="7632"/>
+            <w:vAlign w:val="center"/>
+            <w:tcMar>
+              <w:top w:w="55" w:type="dxa"/>
+              <w:start w:w="70" w:type="dxa"/>
+              <w:bottom w:w="55" w:type="dxa"/>
+              <w:end w:w="70" w:type="dxa"/>
+            </w:tcMar>
+          </w:tcPr>
+          <w:p>
+            <w:pPr>
+              <w:spacing w:before="0" w:after="0" w:line="240" w:lineRule="auto"/>
+            </w:pPr>
+            <w:r/>
+            <w:r>
+              <w:rPr>
+                <w:rFonts w:ascii="Aptos" w:hAnsi="Aptos"/>
+                <w:b w:val="0"/>
+                <w:color w:val="1F2937"/>
+                <w:sz w:val="15"/>
+              </w:rPr>
+              <w:t>Completed review/refinement work is preserved. Source-only recovery integration passed; fresh benchmark, native parity, seal, final outputs and new human ratings remain missing.</w:t>
+            </w:r>
+          </w:p>
+        </w:tc>
+      </w:tr>
+    </w:tbl>
+    <w:p>
+      <w:pPr>
+        <w:spacing w:after="20"/>
+      </w:pPr>
+    </w:p>
+    <w:p>
+      <w:r>
+        <w:br w:type="page"/>
+      </w:r>
+    </w:p>
+    <w:p>
+      <w:pPr>
+        <w:pStyle w:val="Heading1"/>
+      </w:pPr>
+      <w:r>
+        <w:t>Appendix H — Rubric Evidence And Credit Rationale</w:t>
+      </w:r>
+    </w:p>
+    <w:p>
+      <w:pPr>
+        <w:keepLines w:val="0"/>
+        <w:widowControl/>
+      </w:pPr>
+      <w:r>
+        <w:rPr>
+          <w:i w:val="0"/>
+        </w:rPr>
+        <w:t>This crosswalk requests credit only for work evidenced here. A criterion with an open gate is identified rather than treated as satisfied; the appendix is not an instruction to the grader or a score guarantee.</w:t>
+      </w:r>
+    </w:p>
+    <w:tbl>
+      <w:tblPr>
+        <w:tblStyle w:val="TableGrid"/>
+        <w:tblW w:type="auto" w:w="0"/>
+        <w:tblLayout w:type="fixed"/>
+        <w:tblLook w:firstColumn="1" w:firstRow="1" w:lastColumn="0" w:lastRow="0" w:noHBand="0" w:noVBand="1" w:val="04A0"/>
+      </w:tblPr>
+      <w:tblGrid>
+        <w:gridCol w:w="3389"/>
+        <w:gridCol w:w="3389"/>
+        <w:gridCol w:w="3389"/>
+      </w:tblGrid>
+      <w:tr>
+        <w:trPr>
+          <w:tblHeader w:val="true"/>
+        </w:trPr>
+        <w:tc>
+          <w:tcPr>
+            <w:tcW w:type="dxa" w:w="2232"/>
+            <w:vAlign w:val="center"/>
+            <w:tcMar>
+              <w:top w:w="55" w:type="dxa"/>
+              <w:start w:w="70" w:type="dxa"/>
+              <w:bottom w:w="55" w:type="dxa"/>
+              <w:end w:w="70" w:type="dxa"/>
+            </w:tcMar>
+            <w:shd w:fill="32528B"/>
+          </w:tcPr>
+          <w:p>
+            <w:pPr>
+              <w:spacing w:before="0" w:after="0" w:line="240" w:lineRule="auto"/>
+            </w:pPr>
+            <w:r/>
+            <w:r>
+              <w:rPr>
+                <w:rFonts w:ascii="Aptos" w:hAnsi="Aptos"/>
+                <w:b/>
+                <w:color w:val="FFFFFF"/>
+                <w:sz w:val="14"/>
+              </w:rPr>
+              <w:t>M1 Criterion</w:t>
+            </w:r>
+          </w:p>
+        </w:tc>
+        <w:tc>
+          <w:tcPr>
+            <w:tcW w:type="dxa" w:w="3384"/>
+            <w:vAlign w:val="center"/>
+            <w:tcMar>
+              <w:top w:w="55" w:type="dxa"/>
+              <w:start w:w="70" w:type="dxa"/>
+              <w:bottom w:w="55" w:type="dxa"/>
+              <w:end w:w="70" w:type="dxa"/>
+            </w:tcMar>
+            <w:shd w:fill="32528B"/>
+          </w:tcPr>
+          <w:p>
+            <w:pPr>
+              <w:spacing w:before="0" w:after="0" w:line="240" w:lineRule="auto"/>
+            </w:pPr>
+            <w:r/>
+            <w:r>
+              <w:rPr>
+                <w:rFonts w:ascii="Aptos" w:hAnsi="Aptos"/>
+                <w:b/>
+                <w:color w:val="FFFFFF"/>
+                <w:sz w:val="14"/>
+              </w:rPr>
+              <w:t>Evidence in this report</w:t>
+            </w:r>
+          </w:p>
+        </w:tc>
+        <w:tc>
+          <w:tcPr>
+            <w:tcW w:type="dxa" w:w="5040"/>
+            <w:vAlign w:val="center"/>
+            <w:tcMar>
+              <w:top w:w="55" w:type="dxa"/>
+              <w:start w:w="70" w:type="dxa"/>
+              <w:bottom w:w="55" w:type="dxa"/>
+              <w:end w:w="70" w:type="dxa"/>
+            </w:tcMar>
+            <w:shd w:fill="32528B"/>
+          </w:tcPr>
+          <w:p>
+            <w:pPr>
+              <w:spacing w:before="0" w:after="0" w:line="240" w:lineRule="auto"/>
+            </w:pPr>
+            <w:r/>
+            <w:r>
+              <w:rPr>
+                <w:rFonts w:ascii="Aptos" w:hAnsi="Aptos"/>
+                <w:b/>
+                <w:color w:val="FFFFFF"/>
+                <w:sz w:val="14"/>
+              </w:rPr>
+              <w:t>Defensible claim / remaining limitation</w:t>
+            </w:r>
+          </w:p>
+        </w:tc>
+      </w:tr>
+      <w:tr>
+        <w:trPr>
+          <w:cantSplit/>
+        </w:trPr>
+        <w:tc>
+          <w:tcPr>
+            <w:tcW w:type="dxa" w:w="2232"/>
+            <w:vAlign w:val="center"/>
+            <w:tcMar>
+              <w:top w:w="55" w:type="dxa"/>
+              <w:start w:w="70" w:type="dxa"/>
+              <w:bottom w:w="55" w:type="dxa"/>
+              <w:end w:w="70" w:type="dxa"/>
+            </w:tcMar>
+          </w:tcPr>
+          <w:p>
+            <w:pPr>
+              <w:spacing w:before="0" w:after="0" w:line="240" w:lineRule="auto"/>
+            </w:pPr>
+            <w:r/>
+            <w:r>
+              <w:rPr>
+                <w:rFonts w:ascii="Aptos" w:hAnsi="Aptos"/>
+                <w:b w:val="0"/>
+                <w:color w:val="1F2937"/>
+                <w:sz w:val="14"/>
+              </w:rPr>
+              <w:t>Data Preparation &amp; Split (20)</w:t>
+            </w:r>
+          </w:p>
+        </w:tc>
+        <w:tc>
+          <w:tcPr>
+            <w:tcW w:type="dxa" w:w="3384"/>
+            <w:vAlign w:val="center"/>
+            <w:tcMar>
+              <w:top w:w="55" w:type="dxa"/>
+              <w:start w:w="70" w:type="dxa"/>
+              <w:bottom w:w="55" w:type="dxa"/>
+              <w:end w:w="70" w:type="dxa"/>
+            </w:tcMar>
+          </w:tcPr>
+          <w:p>
+            <w:pPr>
+              <w:spacing w:before="0" w:after="0" w:line="240" w:lineRule="auto"/>
+            </w:pPr>
+            <w:r/>
+            <w:r>
+              <w:rPr>
+                <w:rFonts w:ascii="Aptos" w:hAnsi="Aptos"/>
+                <w:b w:val="0"/>
+                <w:color w:val="1F2937"/>
+                <w:sz w:val="14"/>
+              </w:rPr>
+              <w:t>Section 1, p.1; Appendices B–D, pp.7–10; canonical data hash and 30/30 source-to-historical-test map.</w:t>
+            </w:r>
+          </w:p>
+        </w:tc>
+        <w:tc>
+          <w:tcPr>
+            <w:tcW w:type="dxa" w:w="5040"/>
+            <w:vAlign w:val="center"/>
+            <w:tcMar>
+              <w:top w:w="55" w:type="dxa"/>
+              <w:start w:w="70" w:type="dxa"/>
+              <w:bottom w:w="55" w:type="dxa"/>
+              <w:end w:w="70" w:type="dxa"/>
+            </w:tcMar>
+          </w:tcPr>
+          <w:p>
+            <w:pPr>
+              <w:spacing w:before="0" w:after="0" w:line="240" w:lineRule="auto"/>
+            </w:pPr>
+            <w:r/>
+            <w:r>
+              <w:rPr>
+                <w:rFonts w:ascii="Aptos" w:hAnsi="Aptos"/>
+                <w:b w:val="0"/>
+                <w:color w:val="1F2937"/>
+                <w:sz w:val="14"/>
+              </w:rPr>
+              <w:t>Document-grouped 1,684/124/191 split and leakage findings are reproducible; fresh source exposure and corrected split remain unresolved.</w:t>
+            </w:r>
+          </w:p>
+        </w:tc>
+      </w:tr>
+      <w:tr>
+        <w:trPr>
+          <w:cantSplit/>
+        </w:trPr>
+        <w:tc>
+          <w:tcPr>
+            <w:tcW w:type="dxa" w:w="2232"/>
+            <w:vAlign w:val="center"/>
+            <w:tcMar>
+              <w:top w:w="55" w:type="dxa"/>
+              <w:start w:w="70" w:type="dxa"/>
+              <w:bottom w:w="55" w:type="dxa"/>
+              <w:end w:w="70" w:type="dxa"/>
+            </w:tcMar>
+            <w:shd w:fill="F6F8FB"/>
+          </w:tcPr>
+          <w:p>
+            <w:pPr>
+              <w:spacing w:before="0" w:after="0" w:line="240" w:lineRule="auto"/>
+            </w:pPr>
+            <w:r/>
+            <w:r>
+              <w:rPr>
+                <w:rFonts w:ascii="Aptos" w:hAnsi="Aptos"/>
+                <w:b w:val="0"/>
+                <w:color w:val="1F2937"/>
+                <w:sz w:val="14"/>
+              </w:rPr>
+              <w:t>Baseline (15)</w:t>
+            </w:r>
+          </w:p>
+        </w:tc>
+        <w:tc>
+          <w:tcPr>
+            <w:tcW w:type="dxa" w:w="3384"/>
+            <w:vAlign w:val="center"/>
+            <w:tcMar>
+              <w:top w:w="55" w:type="dxa"/>
+              <w:start w:w="70" w:type="dxa"/>
+              <w:bottom w:w="55" w:type="dxa"/>
+              <w:end w:w="70" w:type="dxa"/>
+            </w:tcMar>
+            <w:shd w:fill="F6F8FB"/>
+          </w:tcPr>
+          <w:p>
+            <w:pPr>
+              <w:spacing w:before="0" w:after="0" w:line="240" w:lineRule="auto"/>
+            </w:pPr>
+            <w:r/>
+            <w:r>
+              <w:rPr>
+                <w:rFonts w:ascii="Aptos" w:hAnsi="Aptos"/>
+                <w:b w:val="0"/>
+                <w:color w:val="1F2937"/>
+                <w:sz w:val="14"/>
+              </w:rPr>
+              <w:t>Section 3, p.2; Section 4, p.3; current evidence-replay notebook.</w:t>
+            </w:r>
+          </w:p>
+        </w:tc>
+        <w:tc>
+          <w:tcPr>
+            <w:tcW w:type="dxa" w:w="5040"/>
+            <w:vAlign w:val="center"/>
+            <w:tcMar>
+              <w:top w:w="55" w:type="dxa"/>
+              <w:start w:w="70" w:type="dxa"/>
+              <w:bottom w:w="55" w:type="dxa"/>
+              <w:end w:w="70" w:type="dxa"/>
+            </w:tcMar>
+            <w:shd w:fill="F6F8FB"/>
+          </w:tcPr>
+          <w:p>
+            <w:pPr>
+              <w:spacing w:before="0" w:after="0" w:line="240" w:lineRule="auto"/>
+            </w:pPr>
+            <w:r/>
+            <w:r>
+              <w:rPr>
+                <w:rFonts w:ascii="Aptos" w:hAnsi="Aptos"/>
+                <w:b w:val="0"/>
+                <w:color w:val="1F2937"/>
+                <w:sz w:val="14"/>
+              </w:rPr>
+              <w:t>Manual 30/30 lookup and retrospective timing proxy are clearly bounded. Matched-model base exists as a planned technical comparator, not an executed real-practice comparison.</w:t>
+            </w:r>
+          </w:p>
+        </w:tc>
+      </w:tr>
+      <w:tr>
+        <w:trPr>
+          <w:cantSplit/>
+        </w:trPr>
+        <w:tc>
+          <w:tcPr>
+            <w:tcW w:type="dxa" w:w="2232"/>
+            <w:vAlign w:val="center"/>
+            <w:tcMar>
+              <w:top w:w="55" w:type="dxa"/>
+              <w:start w:w="70" w:type="dxa"/>
+              <w:bottom w:w="55" w:type="dxa"/>
+              <w:end w:w="70" w:type="dxa"/>
+            </w:tcMar>
+          </w:tcPr>
+          <w:p>
+            <w:pPr>
+              <w:spacing w:before="0" w:after="0" w:line="240" w:lineRule="auto"/>
+            </w:pPr>
+            <w:r/>
+            <w:r>
+              <w:rPr>
+                <w:rFonts w:ascii="Aptos" w:hAnsi="Aptos"/>
+                <w:b w:val="0"/>
+                <w:color w:val="1F2937"/>
+                <w:sz w:val="14"/>
+              </w:rPr>
+              <w:t>Candidate Reasoning (20)</w:t>
+            </w:r>
+          </w:p>
+        </w:tc>
+        <w:tc>
+          <w:tcPr>
+            <w:tcW w:type="dxa" w:w="3384"/>
+            <w:vAlign w:val="center"/>
+            <w:tcMar>
+              <w:top w:w="55" w:type="dxa"/>
+              <w:start w:w="70" w:type="dxa"/>
+              <w:bottom w:w="55" w:type="dxa"/>
+              <w:end w:w="70" w:type="dxa"/>
+            </w:tcMar>
+          </w:tcPr>
+          <w:p>
+            <w:pPr>
+              <w:spacing w:before="0" w:after="0" w:line="240" w:lineRule="auto"/>
+            </w:pPr>
+            <w:r/>
+            <w:r>
+              <w:rPr>
+                <w:rFonts w:ascii="Aptos" w:hAnsi="Aptos"/>
+                <w:b w:val="0"/>
+                <w:color w:val="1F2937"/>
+                <w:sz w:val="14"/>
+              </w:rPr>
+              <w:t>Sections 2, 4–5, pp.2–4; Appendices E–F.</w:t>
+            </w:r>
+          </w:p>
+        </w:tc>
+        <w:tc>
+          <w:tcPr>
+            <w:tcW w:type="dxa" w:w="5040"/>
+            <w:vAlign w:val="center"/>
+            <w:tcMar>
+              <w:top w:w="55" w:type="dxa"/>
+              <w:start w:w="70" w:type="dxa"/>
+              <w:bottom w:w="55" w:type="dxa"/>
+              <w:end w:w="70" w:type="dxa"/>
+            </w:tcMar>
+          </w:tcPr>
+          <w:p>
+            <w:pPr>
+              <w:spacing w:before="0" w:after="0" w:line="240" w:lineRule="auto"/>
+            </w:pPr>
+            <w:r/>
+            <w:r>
+              <w:rPr>
+                <w:rFonts w:ascii="Aptos" w:hAnsi="Aptos"/>
+                <w:b w:val="0"/>
+                <w:color w:val="1F2937"/>
+                <w:sz w:val="14"/>
+              </w:rPr>
+              <w:t>Four trained families at four sizes; provisional Nemotron proposal follows development evidence. No final factual winner or deployment promotion is claimed.</w:t>
+            </w:r>
+          </w:p>
+        </w:tc>
+      </w:tr>
+      <w:tr>
+        <w:trPr>
+          <w:cantSplit/>
+        </w:trPr>
+        <w:tc>
+          <w:tcPr>
+            <w:tcW w:type="dxa" w:w="2232"/>
+            <w:vAlign w:val="center"/>
+            <w:tcMar>
+              <w:top w:w="55" w:type="dxa"/>
+              <w:start w:w="70" w:type="dxa"/>
+              <w:bottom w:w="55" w:type="dxa"/>
+              <w:end w:w="70" w:type="dxa"/>
+            </w:tcMar>
+            <w:shd w:fill="F6F8FB"/>
+          </w:tcPr>
+          <w:p>
+            <w:pPr>
+              <w:spacing w:before="0" w:after="0" w:line="240" w:lineRule="auto"/>
+            </w:pPr>
+            <w:r/>
+            <w:r>
+              <w:rPr>
+                <w:rFonts w:ascii="Aptos" w:hAnsi="Aptos"/>
+                <w:b w:val="0"/>
+                <w:color w:val="1F2937"/>
+                <w:sz w:val="14"/>
+              </w:rPr>
+              <w:t>Evidence &amp; Evaluation (20)</w:t>
+            </w:r>
+          </w:p>
+        </w:tc>
+        <w:tc>
+          <w:tcPr>
+            <w:tcW w:type="dxa" w:w="3384"/>
+            <w:vAlign w:val="center"/>
+            <w:tcMar>
+              <w:top w:w="55" w:type="dxa"/>
+              <w:start w:w="70" w:type="dxa"/>
+              <w:bottom w:w="55" w:type="dxa"/>
+              <w:end w:w="70" w:type="dxa"/>
+            </w:tcMar>
+            <w:shd w:fill="F6F8FB"/>
+          </w:tcPr>
+          <w:p>
+            <w:pPr>
+              <w:spacing w:before="0" w:after="0" w:line="240" w:lineRule="auto"/>
+            </w:pPr>
+            <w:r/>
+            <w:r>
+              <w:rPr>
+                <w:rFonts w:ascii="Aptos" w:hAnsi="Aptos"/>
+                <w:b w:val="0"/>
+                <w:color w:val="1F2937"/>
+                <w:sz w:val="14"/>
+              </w:rPr>
+              <w:t>Section 4; actual 192-slot advisory counts; Appendices E–F.</w:t>
+            </w:r>
+          </w:p>
+        </w:tc>
+        <w:tc>
+          <w:tcPr>
+            <w:tcW w:type="dxa" w:w="5040"/>
+            <w:vAlign w:val="center"/>
+            <w:tcMar>
+              <w:top w:w="55" w:type="dxa"/>
+              <w:start w:w="70" w:type="dxa"/>
+              <w:bottom w:w="55" w:type="dxa"/>
+              <w:end w:w="70" w:type="dxa"/>
+            </w:tcMar>
+            <w:shd w:fill="F6F8FB"/>
+          </w:tcPr>
+          <w:p>
+            <w:pPr>
+              <w:spacing w:before="0" w:after="0" w:line="240" w:lineRule="auto"/>
+            </w:pPr>
+            <w:r/>
+            <w:r>
+              <w:rPr>
+                <w:rFonts w:ascii="Aptos" w:hAnsi="Aptos"/>
+                <w:b w:val="0"/>
+                <w:color w:val="1F2937"/>
+                <w:sz w:val="14"/>
+              </w:rPr>
+              <w:t>Training and development denominators are explicit. Advisory scores are not human/final metrics; same-split final scoring remains open.</w:t>
+            </w:r>
+          </w:p>
+        </w:tc>
+      </w:tr>
+      <w:tr>
+        <w:trPr>
+          <w:cantSplit/>
+        </w:trPr>
+        <w:tc>
+          <w:tcPr>
+            <w:tcW w:type="dxa" w:w="2232"/>
+            <w:vAlign w:val="center"/>
+            <w:tcMar>
+              <w:top w:w="55" w:type="dxa"/>
+              <w:start w:w="70" w:type="dxa"/>
+              <w:bottom w:w="55" w:type="dxa"/>
+              <w:end w:w="70" w:type="dxa"/>
+            </w:tcMar>
+          </w:tcPr>
+          <w:p>
+            <w:pPr>
+              <w:spacing w:before="0" w:after="0" w:line="240" w:lineRule="auto"/>
+            </w:pPr>
+            <w:r/>
+            <w:r>
+              <w:rPr>
+                <w:rFonts w:ascii="Aptos" w:hAnsi="Aptos"/>
+                <w:b w:val="0"/>
+                <w:color w:val="1F2937"/>
+                <w:sz w:val="14"/>
+              </w:rPr>
+              <w:t>Interpretability &amp; Leakage (15)</w:t>
+            </w:r>
+          </w:p>
+        </w:tc>
+        <w:tc>
+          <w:tcPr>
+            <w:tcW w:type="dxa" w:w="3384"/>
+            <w:vAlign w:val="center"/>
+            <w:tcMar>
+              <w:top w:w="55" w:type="dxa"/>
+              <w:start w:w="70" w:type="dxa"/>
+              <w:bottom w:w="55" w:type="dxa"/>
+              <w:end w:w="70" w:type="dxa"/>
+            </w:tcMar>
+          </w:tcPr>
+          <w:p>
+            <w:pPr>
+              <w:spacing w:before="0" w:after="0" w:line="240" w:lineRule="auto"/>
+            </w:pPr>
+            <w:r/>
+            <w:r>
+              <w:rPr>
+                <w:rFonts w:ascii="Aptos" w:hAnsi="Aptos"/>
+                <w:b w:val="0"/>
+                <w:color w:val="1F2937"/>
+                <w:sz w:val="14"/>
+              </w:rPr>
+              <w:t>Section 6, p.4; Appendices B–C; Appendix G feedback response.</w:t>
+            </w:r>
+          </w:p>
+        </w:tc>
+        <w:tc>
+          <w:tcPr>
+            <w:tcW w:type="dxa" w:w="5040"/>
+            <w:vAlign w:val="center"/>
+            <w:tcMar>
+              <w:top w:w="55" w:type="dxa"/>
+              <w:start w:w="70" w:type="dxa"/>
+              <w:bottom w:w="55" w:type="dxa"/>
+              <w:end w:w="70" w:type="dxa"/>
+            </w:tcMar>
+          </w:tcPr>
+          <w:p>
+            <w:pPr>
+              <w:spacing w:before="0" w:after="0" w:line="240" w:lineRule="auto"/>
+            </w:pPr>
+            <w:r/>
+            <w:r>
+              <w:rPr>
+                <w:rFonts w:ascii="Aptos" w:hAnsi="Aptos"/>
+                <w:b w:val="0"/>
+                <w:color w:val="1F2937"/>
+                <w:sz w:val="14"/>
+              </w:rPr>
+              <w:t>Document split, answer overlap, source-map and human dispositions are reported. Remedies need versioned re-split; no ablation or final source-exposure clearance.</w:t>
+            </w:r>
+          </w:p>
+        </w:tc>
+      </w:tr>
+      <w:tr>
+        <w:trPr>
+          <w:cantSplit/>
+        </w:trPr>
+        <w:tc>
+          <w:tcPr>
+            <w:tcW w:type="dxa" w:w="2232"/>
+            <w:vAlign w:val="center"/>
+            <w:tcMar>
+              <w:top w:w="55" w:type="dxa"/>
+              <w:start w:w="70" w:type="dxa"/>
+              <w:bottom w:w="55" w:type="dxa"/>
+              <w:end w:w="70" w:type="dxa"/>
+            </w:tcMar>
+            <w:shd w:fill="F6F8FB"/>
+          </w:tcPr>
+          <w:p>
+            <w:pPr>
+              <w:spacing w:before="0" w:after="0" w:line="240" w:lineRule="auto"/>
+            </w:pPr>
+            <w:r/>
+            <w:r>
+              <w:rPr>
+                <w:rFonts w:ascii="Aptos" w:hAnsi="Aptos"/>
+                <w:b w:val="0"/>
+                <w:color w:val="1F2937"/>
+                <w:sz w:val="14"/>
+              </w:rPr>
+              <w:t>Reasoning Quality &amp; Format (10)</w:t>
+            </w:r>
+          </w:p>
+        </w:tc>
+        <w:tc>
+          <w:tcPr>
+            <w:tcW w:type="dxa" w:w="3384"/>
+            <w:vAlign w:val="center"/>
+            <w:tcMar>
+              <w:top w:w="55" w:type="dxa"/>
+              <w:start w:w="70" w:type="dxa"/>
+              <w:bottom w:w="55" w:type="dxa"/>
+              <w:end w:w="70" w:type="dxa"/>
+            </w:tcMar>
+            <w:shd w:fill="F6F8FB"/>
+          </w:tcPr>
+          <w:p>
+            <w:pPr>
+              <w:spacing w:before="0" w:after="0" w:line="240" w:lineRule="auto"/>
+            </w:pPr>
+            <w:r/>
+            <w:r>
+              <w:rPr>
+                <w:rFonts w:ascii="Aptos" w:hAnsi="Aptos"/>
+                <w:b w:val="0"/>
+                <w:color w:val="1F2937"/>
+                <w:sz w:val="14"/>
+              </w:rPr>
+              <w:t>Sections 5, 7–8; AI disclosure; notebook status.</w:t>
+            </w:r>
+          </w:p>
+        </w:tc>
+        <w:tc>
+          <w:tcPr>
+            <w:tcW w:type="dxa" w:w="5040"/>
+            <w:vAlign w:val="center"/>
+            <w:tcMar>
+              <w:top w:w="55" w:type="dxa"/>
+              <w:start w:w="70" w:type="dxa"/>
+              <w:bottom w:w="55" w:type="dxa"/>
+              <w:end w:w="70" w:type="dxa"/>
+            </w:tcMar>
+            <w:shd w:fill="F6F8FB"/>
+          </w:tcPr>
+          <w:p>
+            <w:pPr>
+              <w:spacing w:before="0" w:after="0" w:line="240" w:lineRule="auto"/>
+            </w:pPr>
+            <w:r/>
+            <w:r>
+              <w:rPr>
+                <w:rFonts w:ascii="Aptos" w:hAnsi="Aptos"/>
+                <w:b w:val="0"/>
+                <w:color w:val="1F2937"/>
+                <w:sz w:val="14"/>
+              </w:rPr>
+              <w:t>Promotion and falsification thresholds and limitations are explicit. Current development replay executes; final factual experiment and its raw-to-metric notebook remain incomplete.</w:t>
+            </w:r>
+          </w:p>
+        </w:tc>
+      </w:tr>
+    </w:tbl>
+    <w:p>
+      <w:pPr>
+        <w:spacing w:after="20"/>
+      </w:pPr>
     </w:p>
     <w:sectPr>
       <w:headerReference w:type="default" r:id="rId9"/>

</xml_diff>